<commit_message>
Technical documentation: product comparison with logos, API, third parties, database, sandbox, environment, palette, results summary
</commit_message>
<xml_diff>
--- a/SUBMISSION/6_Execution_Evidence_Index.docx
+++ b/SUBMISSION/6_Execution_Evidence_Index.docx
@@ -839,6 +839,95 @@
                 <w:sz w:val="18"/>
               </w:rPr>
               <w:t>Present: mean 0.98 calls per turn</w:t>
+            </w:r>
+          </w:p>
+        </w:tc>
+      </w:tr>
+      <w:tr>
+        <w:tc>
+          <w:tcPr>
+            <w:tcW w:type="dxa" w:w="2160"/>
+          </w:tcPr>
+          <w:p>
+            <w:r>
+              <w:rPr>
+                <w:sz w:val="18"/>
+              </w:rPr>
+            </w:r>
+            <w:r>
+              <w:rPr>
+                <w:rFonts w:ascii="Consolas" w:hAnsi="Consolas"/>
+                <w:sz w:val="18"/>
+              </w:rPr>
+              <w:t>latency_report.md</w:t>
+            </w:r>
+          </w:p>
+        </w:tc>
+        <w:tc>
+          <w:tcPr>
+            <w:tcW w:type="dxa" w:w="2160"/>
+          </w:tcPr>
+          <w:p>
+            <w:r>
+              <w:rPr>
+                <w:sz w:val="18"/>
+              </w:rPr>
+            </w:r>
+            <w:r>
+              <w:rPr>
+                <w:sz w:val="18"/>
+              </w:rPr>
+              <w:t>Chat turn latency through the sandbox API: rules engine path without a model, and live with the model (5 unique questions, key rotation included)</w:t>
+            </w:r>
+          </w:p>
+        </w:tc>
+        <w:tc>
+          <w:tcPr>
+            <w:tcW w:type="dxa" w:w="2160"/>
+          </w:tcPr>
+          <w:p>
+            <w:r>
+              <w:rPr>
+                <w:sz w:val="18"/>
+              </w:rPr>
+            </w:r>
+            <w:r>
+              <w:rPr>
+                <w:rFonts w:ascii="Consolas" w:hAnsi="Consolas"/>
+                <w:sz w:val="18"/>
+              </w:rPr>
+              <w:t>python -m bench.latency_eval offline</w:t>
+            </w:r>
+            <w:r>
+              <w:rPr>
+                <w:sz w:val="18"/>
+              </w:rPr>
+              <w:t xml:space="preserve"> and </w:t>
+            </w:r>
+            <w:r>
+              <w:rPr>
+                <w:rFonts w:ascii="Consolas" w:hAnsi="Consolas"/>
+                <w:sz w:val="18"/>
+              </w:rPr>
+              <w:t>python -m bench.latency_eval live</w:t>
+            </w:r>
+          </w:p>
+        </w:tc>
+        <w:tc>
+          <w:tcPr>
+            <w:tcW w:type="dxa" w:w="2160"/>
+          </w:tcPr>
+          <w:p>
+            <w:r>
+              <w:rPr>
+                <w:sz w:val="18"/>
+              </w:rPr>
+            </w:r>
+            <w:r>
+              <w:rPr>
+                <w:sz w:val="18"/>
+              </w:rPr>
+              <w:t>Present: offline median 0.18 s over 20 turns, live median 8.59 s over 5 turns (max 40.51 s)</w:t>
             </w:r>
           </w:p>
         </w:tc>

</xml_diff>